<commit_message>
Auto commit (2026-10-07 11:36) — 8 changes
Claude Code 세션 종료 시 자동 커밋.

Co-Authored-By: Claude <noreply@anthropic.com>
</commit_message>
<xml_diff>
--- a/projects/36_slave_dragon_king/Vigloo AI Drama Proposal_THE DRAGON PRINCESS THEY CALLED A SLAVE_KR_CN.docx
+++ b/projects/36_slave_dragon_king/Vigloo AI Drama Proposal_THE DRAGON PRINCESS THEY CALLED A SLAVE_KR_CN.docx
@@ -631,7 +631,7 @@
                 <w:rFonts w:ascii="Malgun Gothic" w:hAnsi="Malgun Gothic" w:eastAsia="Malgun Gothic"/>
                 <w:sz w:val="20"/>
               </w:rPr>
-              <w:t>一个出生那天就被养龙场工人的女儿调了包、当成奴隶长大、天天铲龙粪的龙族公主，在角斗场上喷出和死去的王后母亲一样的白色火焰，露出真正的血脉，让只护着假公主、一直践踏她的三个哥哥跪下，最终成为龙族女王，和曾是假公主未婚夫的龙族大公走到一起的故事。</w:t>
+              <w:t>一个出生那天就和养龙场工人的女儿调了包、当成奴隶长大、天天铲龙粪的龙族公主，在角斗场上喷出和死去的王后母亲一样的白色火焰，露出真正的血脉，让只护着假公主、一直践踏她的三个哥哥跪下，最终成为龙族女王，和曾是假公主未婚夫的龙族大公走到一起的故事。</w:t>
             </w:r>
           </w:p>
         </w:tc>
@@ -1236,7 +1236,7 @@
                 <w:rFonts w:ascii="Malgun Gothic" w:hAnsi="Malgun Gothic" w:eastAsia="Malgun Gothic"/>
                 <w:sz w:val="20"/>
               </w:rPr>
-              <w:t>노예 방울을 끊으려고 투기장에 나선 아이비는, 자기를 태우려던 셋째 오빠 도미닉 앞에서 죽은 왕비와 같은 흰 불을 터뜨린다. 하지만 거스가 왕비가 노예에게 내린 축복일 뿐이라고 둘러대, 아이비는 바네사의 몸종으로 왕궁에 끌려간다. 거스에게서 자기가 가짜라는 걸 들은 바네사는 아이비를 쇠사슬에 묶어 그 피를 마셔 가며 진짜 공주 행세를 한다. 그런데 바네사의 성년 각성 의식에서 정작 아이비 등에 흰 날개가 돋는다. 바네사는 거스에게 아기 아이비에게 공주의 피를 훔쳐 먹였다는 거짓 자백을 시키고, 그 말을 믿은 용왕은 자기 손으로 딸의 날개를 뜯는다.</w:t>
+              <w:t>노예 방울을 끊으려고 투기장에 나선 아이비는, 자기를 태우려던 셋째 오빠 도미닉 앞에서 죽은 왕비와 같은 흰 불을 터뜨린다. 하지만 거스가 그 불은 아이비의 힘이 아니라 왕비가 불쌍한 노예에게 내린 축복일 뿐이라고 둘러대 시합은 무효가 되고, 바네사는 그 노예를 자기 몸종으로 달라고 해 왕궁으로 끌고 간다. 거스에게서 자기가 가짜라는 걸 들은 바네사는 아이비를 쇠사슬에 묶어 그 피를 마셔 가며 진짜 공주 행세를 한다. 그런데 바네사의 성년 각성 의식에서 정작 아이비 등에 흰 날개가 돋는다. 바네사는 거스에게 아기 아이비에게 공주의 피를 훔쳐 먹였다는 거짓 자백을 시키고, 그 말을 믿은 용왕은 자기 손으로 딸의 날개를 뜯는다.</w:t>
             </w:r>
           </w:p>
           <w:p>
@@ -1287,24 +1287,24 @@
                 <w:rFonts w:ascii="Malgun Gothic" w:hAnsi="Malgun Gothic" w:eastAsia="Malgun Gothic"/>
                 <w:sz w:val="20"/>
               </w:rPr>
-              <w:t>为了砍断脚上的奴隶铃铛，艾薇走上角斗场，在要烧死她的三哥多米尼克面前，爆出了和死去的王后一样的白色火焰。可格斯却说那只是王后赐给奴隶的祝福，艾薇就这样被拖进王宫，成了凡妮莎的贴身女仆。凡妮莎从格斯那里得知自己才是假的，便把艾薇锁起来，靠喝她的血冒充真公主。没想到在凡妮莎的成年觉醒仪式上，长出白色翅膀的却是艾薇。凡妮莎逼格斯作假供，说他在艾薇还是婴儿时偷了公主的血喂给她。龙王信了这番话，亲手扯掉了女儿的翅膀。</w:t>
-            </w:r>
-          </w:p>
-          <w:p>
-            <w:r>
-              <w:rPr>
-                <w:rFonts w:ascii="Malgun Gothic" w:hAnsi="Malgun Gothic" w:eastAsia="Malgun Gothic"/>
-                <w:sz w:val="20"/>
-              </w:rPr>
-            </w:r>
-          </w:p>
-          <w:p>
-            <w:r>
-              <w:rPr>
-                <w:rFonts w:ascii="Malgun Gothic" w:hAnsi="Malgun Gothic" w:eastAsia="Malgun Gothic"/>
-                <w:sz w:val="20"/>
-              </w:rPr>
-              <w:t>凡妮莎的未婚夫韦斯利始终守在艾薇身边。背上刺杀龙王罪名、被追进森林的艾薇，在韦斯利怀里第一次完整地化成了龙。龙王终于明白了真相，却还说凡妮莎是自己养了二十年的女儿，护着她。凡妮莎却给龙王下了毒，连亲生父亲格斯也处死了。继承仪式上，王室之火选中了艾薇，三个哥哥这才跪在小妹妹面前。可艾薇说，二十年来没有一个人来找过她，不接受他们的道歉。最后，艾薇打倒了借来黑龙之力的凡妮莎，把她送进养龙场，砍断所有奴隶铃铛，成为龙族女王，和韦斯利走到了一起。</w:t>
+              <w:t>为了摘掉脚上的奴隶铃铛，艾薇走上角斗场，在要烧死她的三哥多米尼克面前，爆出了和死去的王后一样的白色火焰。可格斯却说，那团火不是艾薇自己的力量，只是王后可怜奴隶赐下的祝福，比赛就此作废。凡妮莎又向龙王要了这个奴隶当贴身女仆，把她拖进了王宫。凡妮莎从格斯那里得知自己才是假的，便把艾薇锁起来，靠喝她的血冒充真公主。没想到在凡妮莎的成年觉醒仪式上，长出白色翅膀的却是艾薇。凡妮莎逼格斯作假供，说他偷了公主的血，喂给了还是婴儿的艾薇。龙王信了这番话，亲手扯掉了女儿的翅膀。</w:t>
+            </w:r>
+          </w:p>
+          <w:p>
+            <w:r>
+              <w:rPr>
+                <w:rFonts w:ascii="Malgun Gothic" w:hAnsi="Malgun Gothic" w:eastAsia="Malgun Gothic"/>
+                <w:sz w:val="20"/>
+              </w:rPr>
+            </w:r>
+          </w:p>
+          <w:p>
+            <w:r>
+              <w:rPr>
+                <w:rFonts w:ascii="Malgun Gothic" w:hAnsi="Malgun Gothic" w:eastAsia="Malgun Gothic"/>
+                <w:sz w:val="20"/>
+              </w:rPr>
+              <w:t>凡妮莎的未婚夫韦斯利始终守在艾薇身边。背上刺杀龙王罪名、被追进森林的艾薇，在韦斯利怀里第一次完整地化成了龙。龙王终于明白了真相，却还说凡妮莎是自己养了二十年的女儿，护着她。凡妮莎却给龙王下了毒，连亲生父亲格斯也处死了。继承仪式上，王室之火选中了艾薇，三个哥哥这才跪在小妹妹面前。可艾薇说，二十年来没有一个人来找过她，不接受他们的道歉。最后，艾薇打倒了借来黑龙之力的凡妮莎，把她送进养龙场，摘掉所有奴隶的脚铃，成为龙族女王，和韦斯利走到了一起。</w:t>
             </w:r>
           </w:p>
         </w:tc>
@@ -1645,7 +1645,7 @@
                 <w:rFonts w:ascii="Malgun Gothic" w:hAnsi="Malgun Gothic" w:eastAsia="Malgun Gothic"/>
                 <w:sz w:val="20"/>
               </w:rPr>
-              <w:t>性格及特点: 唯一一个看见王后手镯在女奴掌心发光的男人。他给女奴擦嘴角血迹的手帕烧了起来，人人都叫她奴隶，他却第一个怀疑她身上流着龙族王室的血。免费段里，他当着未婚妻凡妮莎的面替艾薇说话，又把自己家族的披风披在艾薇身上，陪她一起走进角斗场。付费段里，艾薇的翅膀被扯掉后，他留在她身边，说要死一起死；艾薇在森林里第一次化龙、失控乱撞时，是他把她抱住，让她平静下来。最后，他解除了和凡妮莎的婚约，站到了成为龙族女王的艾薇身边。</w:t>
+              <w:t>性格及特点: 唯一一个看见王后手镯在女奴掌心发光的男人。他替女奴擦掉嘴角的血，手帕竟烧了起来。人人都叫她奴隶，他却因此第一个怀疑她流着龙族王室的血。免费集里，他当着未婚妻凡妮莎的面替艾薇说话，又把自己家族的披风披在艾薇身上，陪她一起走进角斗场。付费集里，艾薇的翅膀被扯掉后，他留在她身边，说要死一起死；艾薇在森林里第一次化龙、失控乱撞时，是他把她抱住，让她平静下来。最后，他解除了和凡妮莎的婚约，站到了成为龙族女王的艾薇身边。</w:t>
             </w:r>
           </w:p>
         </w:tc>
@@ -1865,7 +1865,7 @@
                 <w:rFonts w:ascii="Malgun Gothic" w:hAnsi="Malgun Gothic" w:eastAsia="Malgun Gothic"/>
                 <w:sz w:val="20"/>
               </w:rPr>
-              <w:t>性格及特点: 监工扔来的骨头，她一脚踢回监工脚下。挨打也不哭，每次都要顶回去，不是用嘴，就是用拳头。免费段里，为了砍断奴隶铃铛，她把被抢走的报名费抢回来，去角斗场报了名；凡妮莎让她亲手镯，她往手镯上啐了一口带血的唾沫；韦斯利说要替她付赎身钱，她不要，自己上场打，最后爆出了白色火焰。付费段里，她成了凡妮莎的贴身女仆，被锁起来一次次喝血，翅膀被亲生父亲亲手扯掉，又背上刺杀龙王的罪名被追杀，在森林里第一次化成了龙。最后，三个哥哥跪下道歉，她不接受，亲手砍断所有奴隶铃铛，成为龙族女王。</w:t>
+              <w:t>性格及特点: 监工扔来的骨头，她一脚踢回监工脚下。挨打也不哭，每次都要顶回去，不是用嘴，就是用拳头。免费集里，为了摘掉奴隶铃铛，她把被抢走的报名费抢回来，去角斗场报了名；凡妮莎让她亲吻手镯，她往手镯上啐了一口带血的唾沫；韦斯利说要替她付赎身钱，她不要，自己上场打，最后爆出了白色火焰。付费集里，她成了凡妮莎的贴身女仆，被铁链锁着，一次次被放血，翅膀被亲生父亲亲手扯掉，又背上刺杀龙王的罪名被追杀，在森林里第一次化成了龙。最后，三个哥哥跪下道歉，她不接受，亲手摘掉所有奴隶的脚铃，成为龙族女王。</w:t>
             </w:r>
           </w:p>
         </w:tc>
@@ -2104,7 +2104,7 @@
                 <w:rFonts w:ascii="Malgun Gothic" w:hAnsi="Malgun Gothic" w:eastAsia="Malgun Gothic"/>
                 <w:sz w:val="20"/>
               </w:rPr>
-              <w:t>직업 / 배경: 인간 일꾼 거스의 친딸. 태어난 날 아이비와 바꿔치기돼, 반역자들의 불에 불씨가 꺼졌다는 말 아래 공주로 자랐다. 웨슬리의 약혼녀.</w:t>
+              <w:t>직업 / 배경: 인간 일꾼 거스의 친딸. 태어난 날 아이비와 바꿔치기돼, 반역자들의 불에 불씨가 꺼졌다는 말을 모두가 믿어, 의심받지 않고 공주로 자랐다. 웨슬리의 약혼녀.</w:t>
             </w:r>
           </w:p>
           <w:p>
@@ -2148,7 +2148,7 @@
                 <w:rFonts w:ascii="Malgun Gothic" w:hAnsi="Malgun Gothic" w:eastAsia="Malgun Gothic"/>
                 <w:sz w:val="20"/>
               </w:rPr>
-              <w:t>性格及特点: 戴着别人母亲留下的手镯，却口口声声叫它"我妈妈的手镯"的女人。哭一声，就能让龙王和三个哥哥替她出头。免费段里，她撒谎说艾薇想偷手镯，又在角斗场上当着韦斯利的面大喊把艾薇烧了。付费段里，她从格斯那里得知自己是假的，也不肯让出位置。她把艾薇锁起来，用她的血让手镯发光，逼格斯作假供，给护着自己的龙王下毒，连亲生父亲格斯也处死了。最后，她借来黑龙的力量，还是输给了艾薇，被拖进养龙场铲龙粪。</w:t>
+              <w:t>性格及特点: 戴着别人母亲留下的手镯，却口口声声叫它"母后的手镯"的女人。哭一声，就能让龙王和三个哥哥替她出头。免费集里，她撒谎说艾薇想偷手镯，又在角斗场上当着韦斯利的面大喊把艾薇烧了。付费集里，她从格斯那里得知自己是假的，也不肯让出位置。她把艾薇锁起来，用艾薇的血让手镯发光，逼格斯作假供，给护着自己的龙王下毒，连亲生父亲格斯也处死了。最后，她借来黑龙的力量，还是输给了艾薇，被拖进养龙场铲龙粪。</w:t>
             </w:r>
           </w:p>
         </w:tc>
@@ -2360,16 +2360,16 @@
                 <w:rFonts w:ascii="Malgun Gothic" w:hAnsi="Malgun Gothic" w:eastAsia="Malgun Gothic"/>
                 <w:sz w:val="20"/>
               </w:rPr>
-              <w:t>职业 / 背景: 龙王的三个儿子，王储爱德华、掌管角斗场的老二塞巴斯蒂安、用火作战的老三多米尼克。二十年前，他们各自拔下一片龙鳞放进摇篮，发誓要守护小妹妹一辈子，却一直以为那个小妹妹是凡妮莎。</w:t>
-            </w:r>
-          </w:p>
-          <w:p>
-            <w:r>
-              <w:rPr>
-                <w:rFonts w:ascii="Malgun Gothic" w:hAnsi="Malgun Gothic" w:eastAsia="Malgun Gothic"/>
-                <w:sz w:val="20"/>
-              </w:rPr>
-              <w:t>性格及特点: 发誓要守护一辈子的小妹妹，被他们亲手踩在脚下。免费段里，爱德华用剑鞘拦住替艾薇说话的韦斯利；塞巴斯蒂安不让人在名册上写艾薇的名字，只写"铲龙粪的丫头"；多米尼克在角斗场上要烧死艾薇，却被白色火焰挡了回去。付费段里，凡妮莎撕了王后的画像，他们却认定是艾薇干的，把她关进地牢；父亲扯掉艾薇翅膀的时候，没有一个人拦着。直到继承仪式上王室之火选中了艾薇，他们才跪在小妹妹面前。</w:t>
+              <w:t>职业 / 背景: 龙王的三个儿子，王储爱德华、掌管角斗场的二王子塞巴斯蒂安、擅长控火的三王子多米尼克。二十年前，他们各自拔下一片龙鳞放进摇篮，发誓要守护小妹妹一辈子，却一直以为那个小妹妹是凡妮莎。</w:t>
+            </w:r>
+          </w:p>
+          <w:p>
+            <w:r>
+              <w:rPr>
+                <w:rFonts w:ascii="Malgun Gothic" w:hAnsi="Malgun Gothic" w:eastAsia="Malgun Gothic"/>
+                <w:sz w:val="20"/>
+              </w:rPr>
+              <w:t>性格及特点: 发誓要守护一辈子的小妹妹，被他们亲手踩在脚下。免费集里，爱德华用剑鞘拦住替艾薇说话的韦斯利；塞巴斯蒂安不让人在名册上写艾薇的名字，只写"铲龙粪的丫头"；多米尼克在角斗场上要烧死艾薇，却被白色火焰挡了回去。付费集里，凡妮莎撕了王后的画像，他们却认定是艾薇干的，把她关进地牢；父亲扯掉艾薇翅膀的时候，没有一个人拦着。直到继承仪式上王室之火选中了艾薇，他们才跪在小妹妹面前。</w:t>
             </w:r>
           </w:p>
         </w:tc>
@@ -2467,7 +2467,7 @@
                 <w:rFonts w:ascii="Malgun Gothic" w:hAnsi="Malgun Gothic" w:eastAsia="Malgun Gothic"/>
                 <w:sz w:val="20"/>
               </w:rPr>
-              <w:t>性格及特点: 发誓谁敢嘲笑没有火种的女儿，就烧掉谁的舌头，二十年来一直守着这句誓言的父亲。免费段里，他只听凡妮莎的谎话，用掌力把亲生女儿压得跪在地上；直到在角斗场上看见白色火焰，才失神地唤起死去的王后。付费段里，他相信格斯的假供，亲手扯掉了艾薇的翅膀。后来他明白了真相，却还是护着养了二十年的凡妮莎，最后被凡妮莎下了毒。</w:t>
+              <w:t>性格及特点: 发誓谁敢嘲笑没有火种的女儿，就烧掉谁的舌头，二十年来一直守着这句誓言的父亲。免费集里，他只听凡妮莎的谎话，用掌力把亲生女儿压得跪在地上；直到在角斗场上看见白色火焰，才失神地唤了一声亡妻。付费集里，他相信格斯的假供，亲手扯掉了艾薇的翅膀。后来他明白了真相，却还是护着养了二十年的凡妮莎，最后被凡妮莎下了毒。</w:t>
             </w:r>
           </w:p>
         </w:tc>
@@ -2530,7 +2530,7 @@
                 <w:rFonts w:ascii="Malgun Gothic" w:hAnsi="Malgun Gothic" w:eastAsia="Malgun Gothic"/>
                 <w:sz w:val="20"/>
               </w:rPr>
-              <w:t>성격 및 특징: 공주를 데려가면 받을 상보다 자기 딸을 공주로 만드는 쪽을 고른 남자. 무료 구간에서는 아이비가 왕족 눈에 띌까 봐 참가비를 빼앗고 발목에 쇠사슬을 하나 더 감는다. 유료 구간에서는 투기장의 흰 불을 왕비가 노예에게 내린 축복이라 둘러대고, 바네사에게 자기가 친아버지라고 털어놓은 뒤, 바네사가 시키는 대로 거짓 자백을 한다. 끝내 친딸 바네사의 손에 처형된다.</w:t>
+              <w:t>성격 및 특징: 공주를 데려가면 받을 상보다 자기 딸을 공주로 만드는 쪽을 고른 남자. 무료 구간에서는 아이비가 왕족 눈에 띌까 봐 참가비를 빼앗고 발목에 쇠사슬을 하나 더 감는다. 유료 구간에서는 투기장의 흰 불을 왕비가 노예에게 내린 축복이라 둘러대 시합을 무효로 만들고, 바네사에게 자기가 친아버지라고 털어놓은 뒤, 바네사가 시키는 대로 거짓 자백을 한다. 끝내 친딸 바네사의 손에 처형된다.</w:t>
             </w:r>
           </w:p>
           <w:p>
@@ -2556,16 +2556,16 @@
                 <w:rFonts w:ascii="Malgun Gothic" w:hAnsi="Malgun Gothic" w:eastAsia="Malgun Gothic"/>
                 <w:sz w:val="20"/>
               </w:rPr>
-              <w:t>职业 / 背景: 王室养龙场的人类工人。凡妮莎的亲生父亲，也是把艾薇骗成自己女儿养大的人。</w:t>
-            </w:r>
-          </w:p>
-          <w:p>
-            <w:r>
-              <w:rPr>
-                <w:rFonts w:ascii="Malgun Gothic" w:hAnsi="Malgun Gothic" w:eastAsia="Malgun Gothic"/>
-                <w:sz w:val="20"/>
-              </w:rPr>
-              <w:t>性格及特点: 比起把公主送回去领赏，他选了让自己的女儿当公主。免费段里，他怕艾薇被王族撞见，抢走她的报名费，又在她脚踝上多缠了一条铁链。付费段里，他把角斗场上的白色火焰说成是王后赐给奴隶的祝福，向凡妮莎坦白自己才是她的亲爹，之后照凡妮莎的吩咐作了假供。最后，他死在亲生女儿凡妮莎手里。</w:t>
+              <w:t>职业 / 背景: 王室养龙场的人类工人。凡妮莎的亲生父亲，也是把艾薇冒充成自己的女儿、一手养大的人。</w:t>
+            </w:r>
+          </w:p>
+          <w:p>
+            <w:r>
+              <w:rPr>
+                <w:rFonts w:ascii="Malgun Gothic" w:hAnsi="Malgun Gothic" w:eastAsia="Malgun Gothic"/>
+                <w:sz w:val="20"/>
+              </w:rPr>
+              <w:t>性格及特点: 比起把公主送回去领赏，他选了让自己的女儿当公主。免费集里，他怕艾薇被王族撞见，抢走她的报名费，又在她脚踝上多缠了一条铁链。付费集里，他把角斗场上的白色火焰说成是王后赐给奴隶的祝福，让那场比赛作废，向凡妮莎坦白自己才是她的亲爹，之后照凡妮莎的吩咐作了假供。最后，他死在亲生女儿凡妮莎手里。</w:t>
             </w:r>
           </w:p>
         </w:tc>
@@ -2853,7 +2853,7 @@
                 <w:rFonts w:ascii="Malgun Gothic" w:hAnsi="Malgun Gothic" w:eastAsia="Malgun Gothic"/>
                 <w:sz w:val="20"/>
               </w:rPr>
-              <w:t>- 假公主被拖进养龙场，所有奴隶铃铛都被新女王亲手砍断</w:t>
+              <w:t>- 假公主被拖进养龙场，所有奴隶的脚铃都被新女王亲手摘掉</w:t>
             </w:r>
           </w:p>
         </w:tc>
@@ -3192,25 +3192,25 @@
                 <w:rFonts w:ascii="Malgun Gothic" w:hAnsi="Malgun Gothic" w:eastAsia="Malgun Gothic"/>
                 <w:sz w:val="20"/>
               </w:rPr>
-              <w:t>1. 原作的骨架我们原样保留。调包、只对真血脉有反应的王后遗物、在角斗场上爆发的觉醒、父亲亲手扯掉翅膀、假货给护着自己的父亲下毒，这些让原作拿下第一的场面全部保留。改的只是主角的性别，和主角身边的人物关系。</w:t>
-            </w:r>
-          </w:p>
-          <w:p>
-            <w:r>
-              <w:rPr>
-                <w:rFonts w:ascii="Malgun Gothic" w:hAnsi="Malgun Gothic" w:eastAsia="Malgun Gothic"/>
-                <w:sz w:val="20"/>
-              </w:rPr>
-              <w:t>2. 受众定位接近中性向，但稍微往女性那边偏一点。正如老师您说的，我们平台的男频偏弱，所以角斗场对决、身份逆转这类男女观众都觉得爽的场面，我们按原作的力度保留；在这之上，再加上三个哥哥的追悔和韦斯利的感情线，给女性观众多一个继续往下看的理由。</w:t>
-            </w:r>
-          </w:p>
-          <w:p>
-            <w:r>
-              <w:rPr>
-                <w:rFonts w:ascii="Malgun Gothic" w:hAnsi="Malgun Gothic" w:eastAsia="Malgun Gothic"/>
-                <w:sz w:val="20"/>
-              </w:rPr>
-              <w:t>3. 艾薇和原作主角一样，骨头被折断也不低头。她不会哭着等人来救，每次都亲手顶回去，所以就算换成女主，原作的爽感也一点不少。</w:t>
+              <w:t>1. 原作的骨架我们原样保留。调包、只对真血脉有反应的王后遗物、在角斗场上爆发的觉醒、父亲亲手扯掉翅膀、假货给护着自己的父亲下毒，这些把原作送上榜首的名场面，我们一个不动。改的只是主角的性别，和主角身边的人物关系。</w:t>
+            </w:r>
+          </w:p>
+          <w:p>
+            <w:r>
+              <w:rPr>
+                <w:rFonts w:ascii="Malgun Gothic" w:hAnsi="Malgun Gothic" w:eastAsia="Malgun Gothic"/>
+                <w:sz w:val="20"/>
+              </w:rPr>
+              <w:t>2. 受众定位接近中性向，但稍微往女性那边偏一点。正如老师您说的，我们平台的男频偏弱，所以角斗场对决、身份逆转这类男女观众都觉得爽的场面，我们按原作的力度保留；在这之上，再加上三个哥哥的火葬场和韦斯利的感情线，给女性观众多一个继续往下看的理由。</w:t>
+            </w:r>
+          </w:p>
+          <w:p>
+            <w:r>
+              <w:rPr>
+                <w:rFonts w:ascii="Malgun Gothic" w:hAnsi="Malgun Gothic" w:eastAsia="Malgun Gothic"/>
+                <w:sz w:val="20"/>
+              </w:rPr>
+              <w:t>3. 艾薇和原作主角一样，骨头断了也不低头。她不会哭着等人来救，每次都自己还手，所以就算换成女主，原作的爽感也一点不少。</w:t>
             </w:r>
           </w:p>
         </w:tc>
@@ -3562,41 +3562,41 @@
                 <w:rFonts w:ascii="Malgun Gothic" w:hAnsi="Malgun Gothic" w:eastAsia="Malgun Gothic"/>
                 <w:sz w:val="20"/>
               </w:rPr>
-              <w:t>叛乱的黑龙火烧王宫高塔的那一夜，龙王的小女儿艾薇出生了。会喷白色火焰的白龙王后用翅膀护住高塔，挡下叛军的火，自己却死了。中了火箭的奶妈抱着艾薇爬到王室养龙场，告诉人类工人格斯，把公主送回王宫就能领一大笔赏，说完便断了气。格斯从艾薇手腕上解下用王后龙鳞做成的白色手镯，戴到同一天出生的亲生女儿凡妮莎手上。"与其找国王领赏，不如让我女儿当公主。"</w:t>
-            </w:r>
-          </w:p>
-          <w:p>
-            <w:r>
-              <w:rPr>
-                <w:rFonts w:ascii="Malgun Gothic" w:hAnsi="Malgun Gothic" w:eastAsia="Malgun Gothic"/>
-                <w:sz w:val="20"/>
-              </w:rPr>
-            </w:r>
-          </w:p>
-          <w:p>
-            <w:r>
-              <w:rPr>
-                <w:rFonts w:ascii="Malgun Gothic" w:hAnsi="Malgun Gothic" w:eastAsia="Malgun Gothic"/>
-                <w:sz w:val="20"/>
-              </w:rPr>
-              <w:t>龙族王室的血里混着火种，婴儿每次哭都会迸出火星，可格斯当成公主抱进王宫的凡妮莎，哭起来一点火星都没有。侍从们禀报说，公主的火种被叛军的火熄灭了。龙王发誓，谁敢因为这孩子没有火种嘲笑她，他就烧掉谁的舌头。三位年幼的王子，王储爱德华、老二塞巴斯蒂安、老三多米尼克，也各自拔下一片龙鳞放进摇篮，发誓要守护小妹妹一辈子。</w:t>
-            </w:r>
-          </w:p>
-          <w:p>
-            <w:r>
-              <w:rPr>
-                <w:rFonts w:ascii="Malgun Gothic" w:hAnsi="Malgun Gothic" w:eastAsia="Malgun Gothic"/>
-                <w:sz w:val="20"/>
-              </w:rPr>
-            </w:r>
-          </w:p>
-          <w:p>
-            <w:r>
-              <w:rPr>
-                <w:rFonts w:ascii="Malgun Gothic" w:hAnsi="Malgun Gothic" w:eastAsia="Malgun Gothic"/>
-                <w:sz w:val="20"/>
-              </w:rPr>
-              <w:t>二十年后，三个哥哥的宠爱全被凡妮莎一个人占了。真公主艾薇一直以为自己是人类奴隶，脚踝上戴着奴隶铃铛，天天铲龙粪，还管从小打她、把她养大的格斯叫爹。三个哥哥谁都不知道，他们发誓要守护一辈子的真正的小妹妹，就在养龙场的地上。</w:t>
+              <w:t>叛乱的黑龙火烧王宫高塔的那一夜，龙王的小女儿艾薇出生了。会喷白色火焰的白龙王后用翅膀护住高塔，挡下叛军的火，自己却死了。身中火矢的奶妈抱着艾薇爬到王室养龙场，告诉人类工人格斯，把公主送回王宫就能领一大笔赏，说完便断了气。格斯从艾薇手腕上解下用王后龙鳞做成的白色手镯，戴到同一天出生的亲生女儿凡妮莎手上。"与其找龙王领赏，不如让我女儿当公主。"</w:t>
+            </w:r>
+          </w:p>
+          <w:p>
+            <w:r>
+              <w:rPr>
+                <w:rFonts w:ascii="Malgun Gothic" w:hAnsi="Malgun Gothic" w:eastAsia="Malgun Gothic"/>
+                <w:sz w:val="20"/>
+              </w:rPr>
+            </w:r>
+          </w:p>
+          <w:p>
+            <w:r>
+              <w:rPr>
+                <w:rFonts w:ascii="Malgun Gothic" w:hAnsi="Malgun Gothic" w:eastAsia="Malgun Gothic"/>
+                <w:sz w:val="20"/>
+              </w:rPr>
+              <w:t>龙族王室的血里混着火种，婴儿每次哭都会迸出火星，可格斯当成公主抱进王宫的凡妮莎，哭起来一点火星都没有。侍从们禀报说，公主的火种被叛军的火熄灭了。龙王发誓，谁敢因为这孩子没有火种嘲笑她，他就烧掉谁的舌头。三位年幼的王子，王储爱德华、二王子塞巴斯蒂安、三王子多米尼克，也各自拔下一片龙鳞放进摇篮，发誓要守护小妹妹一辈子。</w:t>
+            </w:r>
+          </w:p>
+          <w:p>
+            <w:r>
+              <w:rPr>
+                <w:rFonts w:ascii="Malgun Gothic" w:hAnsi="Malgun Gothic" w:eastAsia="Malgun Gothic"/>
+                <w:sz w:val="20"/>
+              </w:rPr>
+            </w:r>
+          </w:p>
+          <w:p>
+            <w:r>
+              <w:rPr>
+                <w:rFonts w:ascii="Malgun Gothic" w:hAnsi="Malgun Gothic" w:eastAsia="Malgun Gothic"/>
+                <w:sz w:val="20"/>
+              </w:rPr>
+              <w:t>二十年后，三个哥哥的宠爱全被凡妮莎一个人占了。真公主艾薇一直以为自己是人类奴隶，脚踝上戴着奴隶铃铛，天天铲龙粪，还管从小打她、把她养大的格斯叫爹。三个哥哥谁都不知道，他们发誓要守护一辈子的真正的小妹妹，正在养龙场里铲龙粪。</w:t>
             </w:r>
           </w:p>
           <w:p>
@@ -3682,7 +3682,7 @@
                 <w:rFonts w:ascii="Malgun Gothic" w:hAnsi="Malgun Gothic" w:eastAsia="Malgun Gothic"/>
                 <w:sz w:val="20"/>
               </w:rPr>
-              <w:t>格斯翻出来的，是艾薇偷偷攒下的一袋银币，王室角斗场的报名费。格斯怕艾薇出了养龙场撞见王族，调包的事会败露，就把那袋钱塞到监工手里，求他别让艾薇踏出养龙场一步，又在艾薇脚踝的铃铛上多缠了一条铁链。这时城墙外号角响起，王宫的传令官高喊，今年角斗场的冠军就算是奴隶，也能向龙王许一个愿望。艾薇不知道那位龙王就是自己的亲生父亲，她死死盯着监工腰间晃来晃去的银币袋。"那笔钱我会拿回来。我要在角斗场上打赢，让龙王先把这铃铛砍了。"</w:t>
+              <w:t>格斯翻出来的，是艾薇偷偷攒下的一袋银币，王室角斗场的报名费。格斯怕艾薇出了养龙场撞见王族，调包的事会败露，就把那袋钱塞到监工手里，求他别让艾薇踏出养龙场一步，又在艾薇脚踝的铃铛上多缠了一条铁链。这时城墙外号角响起，王宫的传令官高喊，今年角斗场的冠军就算是奴隶，也能向龙王许一个愿望。艾薇不知道那位龙王就是自己的亲生父亲，她死死盯着监工腰间晃来晃去的银币袋。"那袋钱我一定抢回来。等我在角斗场上打赢了，就让龙王先把我脚上这铃铛摘了。"</w:t>
             </w:r>
           </w:p>
           <w:p>
@@ -3768,7 +3768,7 @@
                 <w:rFonts w:ascii="Malgun Gothic" w:hAnsi="Malgun Gothic" w:eastAsia="Malgun Gothic"/>
                 <w:sz w:val="20"/>
               </w:rPr>
-              <w:t>艾薇走出报名处，凡妮莎的队伍正好经过，凡妮莎手腕上的白色手镯松脱下来，滚到艾薇脚边。二十年来，这只手镯在凡妮莎手腕上从没亮过一次，大家都以为是公主的火种熄灭了的缘故。可艾薇一捡起来，手镯就在她掌心里亮起了一瞬白光。看见这道光的，只有凡妮莎的未婚夫、龙族大公韦斯利。韦斯利盯着女奴的手移不开眼，凡妮莎咬紧了嘴唇，三哥多米尼克从马上跳了下来。他不知道留下这只手镯的王后，就是眼前这个女奴的母亲，手里腾起了红色火焰。"你敢把粪蹭到我们母亲的手镯上？今天就把你烧死在这儿。"</w:t>
+              <w:t>艾薇走出报名处，凡妮莎的队伍正好经过，凡妮莎手腕上的白色手镯松脱下来，滚到艾薇脚边。二十年来，这只手镯在凡妮莎手腕上从没亮过一次，大家都以为是公主的火种熄灭了的缘故。可艾薇一捡起来，手镯就在她掌心里亮起了一瞬白光。看见这道光的，只有凡妮莎的未婚夫、龙族大公韦斯利。韦斯利盯着女奴的手移不开眼，凡妮莎咬紧了嘴唇，三哥多米尼克从马上跳了下来。他不知道留下这只手镯的王后，就是眼前这个女奴的母亲，手里腾起了红色火焰。"你敢把粪蹭到母后的手镯上？今天就把你烧死在这儿。"</w:t>
             </w:r>
           </w:p>
           <w:p>
@@ -3837,24 +3837,24 @@
                 <w:rFonts w:ascii="Malgun Gothic" w:hAnsi="Malgun Gothic" w:eastAsia="Malgun Gothic"/>
                 <w:sz w:val="20"/>
               </w:rPr>
-              <w:t>多米尼克的火停在了艾薇脸前。从天而降的龙王空手攥灭了那团火。凡妮莎扑到龙王身上哭，说那个奴隶想偷母亲的手镯，还说没有火种的公主根本不配戴，这全是谎话。韦斯利站出来说她只是捡起了掉在地上的手镯，龙王却说，奴隶的手碰了王后留下的手镯，还把我女儿惹哭了，对着半空把手掌往下一压。一股看不见的重量压下来，艾薇的膝盖砸进了石板地里。龙王当成女儿护着的凡妮莎是格斯的女儿，而他真正的女儿，此刻正被压在他的手掌之下。</w:t>
-            </w:r>
-          </w:p>
-          <w:p>
-            <w:r>
-              <w:rPr>
-                <w:rFonts w:ascii="Malgun Gothic" w:hAnsi="Malgun Gothic" w:eastAsia="Malgun Gothic"/>
-                <w:sz w:val="20"/>
-              </w:rPr>
-            </w:r>
-          </w:p>
-          <w:p>
-            <w:r>
-              <w:rPr>
-                <w:rFonts w:ascii="Malgun Gothic" w:hAnsi="Malgun Gothic" w:eastAsia="Malgun Gothic"/>
-                <w:sz w:val="20"/>
-              </w:rPr>
-              <w:t>凡妮莎把戴着手镯的手腕伸到艾薇嘴边，笑着说只要她亲一下母亲的手镯、求个饶，就放她回养龙场。韦斯利往前一步，王储爱德华用剑鞘抵住了他的胸口。艾薇往手镯上啐了一口带血的唾沫。"龙粪我铲了二十年，你的手腕我也不亲。"就在那一刻，沾了艾薇血的手镯亮起白光，低头看着凡妮莎手腕的龙王和爱德华，当场僵住。</w:t>
+              <w:t>多米尼克的火停在了艾薇脸前。从天而降的龙王空手攥灭了那团火。凡妮莎扑到龙王身上哭着说，那个奴隶想偷母后的手镯，还骂她这个没有火种的公主不配戴。这些全是谎话。韦斯利站出来说她只是捡起了掉在地上的手镯，龙王却说，奴隶的手碰了王后留下的手镯，还把我女儿惹哭了，对着半空把手掌往下一压。一股看不见的重量压下来，艾薇的膝盖砸进了石板地里。龙王当成女儿护着的凡妮莎是格斯的女儿，而他真正的女儿，此刻正被压在他的手掌之下。</w:t>
+            </w:r>
+          </w:p>
+          <w:p>
+            <w:r>
+              <w:rPr>
+                <w:rFonts w:ascii="Malgun Gothic" w:hAnsi="Malgun Gothic" w:eastAsia="Malgun Gothic"/>
+                <w:sz w:val="20"/>
+              </w:rPr>
+            </w:r>
+          </w:p>
+          <w:p>
+            <w:r>
+              <w:rPr>
+                <w:rFonts w:ascii="Malgun Gothic" w:hAnsi="Malgun Gothic" w:eastAsia="Malgun Gothic"/>
+                <w:sz w:val="20"/>
+              </w:rPr>
+              <w:t>凡妮莎把戴着手镯的手腕伸到艾薇嘴边，笑着说只要她亲吻一下母后的手镯、求个饶，就放她回养龙场。韦斯利往前一步，王储爱德华用剑鞘抵住了他的胸口。艾薇往手镯上啐了一口带血的唾沫。"龙粪我能铲二十年，你的手腕，我可不亲。"就在那一刻，沾了艾薇血的手镯亮起白光，低头看着凡妮莎手腕的龙王和爱德华，当场僵住。</w:t>
             </w:r>
           </w:p>
           <w:p>
@@ -3923,24 +3923,24 @@
                 <w:rFonts w:ascii="Malgun Gothic" w:hAnsi="Malgun Gothic" w:eastAsia="Malgun Gothic"/>
                 <w:sz w:val="20"/>
               </w:rPr>
-              <w:t>手镯一亮，凡妮莎就把戴手镯的手高高举起，喊着母亲终于认出她了。龙王和三个哥哥都不知道，让手镯发光的，是沾在上面的艾薇的血。龙王说王后的手镯亮着，不能在它面前见血，收回了手。凡妮莎却拉住龙王的袖子小声说，在这儿弄死她，大家会说龙王压死了一个奴隶，不如让她明天死在角斗场的比赛上。龙王一点头，多米尼克就站出来，说明天由他替没有火种的凡妮莎，亲手烧死那个丫头。</w:t>
-            </w:r>
-          </w:p>
-          <w:p>
-            <w:r>
-              <w:rPr>
-                <w:rFonts w:ascii="Malgun Gothic" w:hAnsi="Malgun Gothic" w:eastAsia="Malgun Gothic"/>
-                <w:sz w:val="20"/>
-              </w:rPr>
-            </w:r>
-          </w:p>
-          <w:p>
-            <w:r>
-              <w:rPr>
-                <w:rFonts w:ascii="Malgun Gothic" w:hAnsi="Malgun Gothic" w:eastAsia="Malgun Gothic"/>
-                <w:sz w:val="20"/>
-              </w:rPr>
-              <w:t>众人散去的街上，韦斯利用自己的手帕擦去倒在地上的艾薇嘴角的血。可沾了血的手帕在他手里冒起烟，烧了起来。血里混着火种的，只有龙族王室。韦斯利问她是谁的女儿，艾薇眼神涣散地回答。"养龙场的工人，格斯的女儿。"</w:t>
+              <w:t>手镯一亮，凡妮莎就把戴手镯的手高高举起，喊着母后终于认出她了。龙王和三个哥哥都不知道，让手镯发光的，是沾在上面的艾薇的血。龙王说王后的手镯亮着，不能在它面前见血，收回了手。凡妮莎却拉住龙王的袖子小声说，在这儿弄死她，大家会说龙王压死了一个奴隶，不如让她明天死在角斗场的比赛上。龙王一点头，多米尼克就站出来，说明天由他替没有火种的凡妮莎，亲手烧死那个丫头。</w:t>
+            </w:r>
+          </w:p>
+          <w:p>
+            <w:r>
+              <w:rPr>
+                <w:rFonts w:ascii="Malgun Gothic" w:hAnsi="Malgun Gothic" w:eastAsia="Malgun Gothic"/>
+                <w:sz w:val="20"/>
+              </w:rPr>
+            </w:r>
+          </w:p>
+          <w:p>
+            <w:r>
+              <w:rPr>
+                <w:rFonts w:ascii="Malgun Gothic" w:hAnsi="Malgun Gothic" w:eastAsia="Malgun Gothic"/>
+                <w:sz w:val="20"/>
+              </w:rPr>
+              <w:t>众人散去的街上，艾薇倒在地上，韦斯利拿自己的手帕替她擦去嘴角的血。可沾了血的手帕在他手里冒起烟，烧了起来。血里混着火种的，只有龙族王室。韦斯利问她是谁的女儿，艾薇眼神涣散地回答："养龙场的工人，格斯的女儿。"</w:t>
             </w:r>
           </w:p>
           <w:p>
@@ -4009,24 +4009,24 @@
                 <w:rFonts w:ascii="Malgun Gothic" w:hAnsi="Malgun Gothic" w:eastAsia="Malgun Gothic"/>
                 <w:sz w:val="20"/>
               </w:rPr>
-              <w:t>那天夜里，凡妮莎把手镯凑到烛火上，又按在胸口，手镯都再没亮过。凡妮莎把手镯扔给侍女，说只要明天那个奴隶一死，母亲的手镯就会重新只为她一个人发光。可就连凡妮莎自己也不知道，她是养龙场工人格斯的女儿。</w:t>
-            </w:r>
-          </w:p>
-          <w:p>
-            <w:r>
-              <w:rPr>
-                <w:rFonts w:ascii="Malgun Gothic" w:hAnsi="Malgun Gothic" w:eastAsia="Malgun Gothic"/>
-                <w:sz w:val="20"/>
-              </w:rPr>
-            </w:r>
-          </w:p>
-          <w:p>
-            <w:r>
-              <w:rPr>
-                <w:rFonts w:ascii="Malgun Gothic" w:hAnsi="Malgun Gothic" w:eastAsia="Malgun Gothic"/>
-                <w:sz w:val="20"/>
-              </w:rPr>
-              <w:t>第二天一早，角斗场看台上的贵族们拿金币打赌，赌多米尼克先烧那丫头的头发还是先烧衣服；塞巴斯蒂安说反正她要死，提前在名册上"铲龙粪的丫头"那一栏画了一道线。就在这时，艾薇从角斗场的大门走了进来。她肩上披着韦斯利家族的银色披风，韦斯利就站在她身旁。公主的未婚夫把自己的披风给女奴穿，看台上一片哗然，前排的凡妮莎死死抓住栏杆大喊。"哥，连那件披风一起烧了。当着韦斯利的面，烧得连一把灰都不剩。"</w:t>
+              <w:t>那天夜里，凡妮莎把手镯凑到烛火上，又按在胸口，手镯却再也没亮过。凡妮莎把手镯扔给侍女，说只要明天那个奴隶一死，母后的手镯就会重新只为她一个人发光。可就连凡妮莎自己也不知道，她是养龙场工人格斯的女儿。</w:t>
+            </w:r>
+          </w:p>
+          <w:p>
+            <w:r>
+              <w:rPr>
+                <w:rFonts w:ascii="Malgun Gothic" w:hAnsi="Malgun Gothic" w:eastAsia="Malgun Gothic"/>
+                <w:sz w:val="20"/>
+              </w:rPr>
+            </w:r>
+          </w:p>
+          <w:p>
+            <w:r>
+              <w:rPr>
+                <w:rFonts w:ascii="Malgun Gothic" w:hAnsi="Malgun Gothic" w:eastAsia="Malgun Gothic"/>
+                <w:sz w:val="20"/>
+              </w:rPr>
+              <w:t>第二天一早，角斗场看台上的贵族们拿金币打赌，赌多米尼克先烧那丫头的头发还是先烧衣服；塞巴斯蒂安说反正她要死，提前把名册上的"铲龙粪的丫头"一笔划掉。就在这时，艾薇从角斗场的大门走了进来。她肩上披着韦斯利家族的银色披风，韦斯利就站在她身旁。公主的未婚夫把自己的披风给女奴穿，看台上一片哗然，前排的凡妮莎死死抓住栏杆大喊："哥，连那件披风一起烧了。当着韦斯利的面，烧得连一把灰都不剩。"</w:t>
             </w:r>
           </w:p>
           <w:p>
@@ -4095,24 +4095,24 @@
                 <w:rFonts w:ascii="Malgun Gothic" w:hAnsi="Malgun Gothic" w:eastAsia="Malgun Gothic"/>
                 <w:sz w:val="20"/>
               </w:rPr>
-              <w:t>喊声回荡的沙场入口，韦斯利拉住艾薇，说他来付赎身钱放她自由，今天别上场。艾薇脱下披风，还到韦斯利手里。"你把我买下来，我也只是换了个主人。这铃铛，我要自己打赢了砍断。"多米尼克说对付一个奴隶要用两只手，是龙族的耻辱，把右手背到身后。可二十年来一直空手按住发狂坐骑龙脑袋的艾薇，一把拧住多米尼克的左臂，把他狠狠摔进沙地。</w:t>
-            </w:r>
-          </w:p>
-          <w:p>
-            <w:r>
-              <w:rPr>
-                <w:rFonts w:ascii="Malgun Gothic" w:hAnsi="Malgun Gothic" w:eastAsia="Malgun Gothic"/>
-                <w:sz w:val="20"/>
-              </w:rPr>
-            </w:r>
-          </w:p>
-          <w:p>
-            <w:r>
-              <w:rPr>
-                <w:rFonts w:ascii="Malgun Gothic" w:hAnsi="Malgun Gothic" w:eastAsia="Malgun Gothic"/>
-                <w:sz w:val="20"/>
-              </w:rPr>
-              <w:t>看台上一片尖叫，爬起来的多米尼克把背在身后的那只手也拿了出来，把艾薇压在沙地上，一脚踩响她脚踝上的铃铛。"听见了吗？奴隶铃铛的声音。这就是你。"回到看台的韦斯利想翻过栏杆，被守卫拦住，凡妮莎尖叫着让多米尼克现在就烧。多米尼克的红色火焰扑向艾薇的那一瞬间，艾薇的双眼燃起白光，两手爆出白色火焰。前排的凡妮莎攥着手腕惨叫。王后的手镯烧得发白，正烫着凡妮莎的皮肉。从王座上站起来的龙王，看着和二十年前死去的王后一模一样的白色火焰，喃喃道。"亲爱的……"</w:t>
+              <w:t>喊声回荡的沙场入口，韦斯利拉住艾薇，说他来付赎身钱放她自由，今天别上场。艾薇脱下披风，还到韦斯利手里。"你把我买下来，我也只是换了个主人。这铃铛，我自己打赢了再摘。"多米尼克说对付一个奴隶还用两只手，丢龙族的脸，把右手背到身后。可二十年来一直空手按住发狂坐骑龙脑袋的艾薇，一把拧住多米尼克的左臂，把他狠狠摔进沙地。</w:t>
+            </w:r>
+          </w:p>
+          <w:p>
+            <w:r>
+              <w:rPr>
+                <w:rFonts w:ascii="Malgun Gothic" w:hAnsi="Malgun Gothic" w:eastAsia="Malgun Gothic"/>
+                <w:sz w:val="20"/>
+              </w:rPr>
+            </w:r>
+          </w:p>
+          <w:p>
+            <w:r>
+              <w:rPr>
+                <w:rFonts w:ascii="Malgun Gothic" w:hAnsi="Malgun Gothic" w:eastAsia="Malgun Gothic"/>
+                <w:sz w:val="20"/>
+              </w:rPr>
+              <w:t>看台上一片尖叫，爬起来的多米尼克把背在身后的那只手也拿了出来，把艾薇压在沙地上，一脚踩响她脚踝上的铃铛。"听见了吗？奴隶铃铛的声音。这就是你。"回到看台的韦斯利想翻过栏杆，被守卫拦住，凡妮莎尖叫着让多米尼克现在就烧。多米尼克的红色火焰扑向艾薇的那一瞬间，艾薇的双眼燃起白光，两手爆出白色火焰。前排的凡妮莎攥着手腕惨叫。王后的手镯烧得发白，正烫着凡妮莎的皮肉。从王座上站起来的龙王，看着和二十年前死去的王后一模一样的白色火焰，喃喃道："吾妻……"</w:t>
             </w:r>
           </w:p>
         </w:tc>

</xml_diff>